<commit_message>
Add documentation diagrams and update DOCX
</commit_message>
<xml_diff>
--- a/Documentation/Текст защиты.docx
+++ b/Documentation/Текст защиты.docx
@@ -60,14 +60,14 @@
           <w:b/>
           <w:bCs/>
         </w:rPr>
-        <w:t>Поток</w:t>
-      </w:r>
-      <w:r>
-        <w:rPr>
-          <w:b/>
-          <w:bCs/>
-        </w:rPr>
-        <w:t xml:space="preserve"> — корпоративный планировщик задач с Kanban-доской, ролевой моделью и AI-генерацией»</w:t>
+        <w:t>Проектирование и разработка планировщика задач для компании</w:t>
+      </w:r>
+      <w:r>
+        <w:rPr>
+          <w:b/>
+          <w:bCs/>
+        </w:rPr>
+        <w:t>»</w:t>
       </w:r>
       <w:r>
         <w:t>.</w:t>
@@ -3107,7 +3107,6 @@
   <w:style w:type="character" w:default="1" w:styleId="a0">
     <w:name w:val="Default Paragraph Font"/>
     <w:uiPriority w:val="1"/>
-    <w:semiHidden/>
     <w:unhideWhenUsed/>
   </w:style>
   <w:style w:type="table" w:default="1" w:styleId="a1">

</xml_diff>